<commit_message>
Yan reklam alanlarını ve premium footerı tamamla
</commit_message>
<xml_diff>
--- a/docs/yonetim/Koza-TV-Reklam-Merkezi-Yonetim-Kilavuzu.docx
+++ b/docs/yonetim/Koza-TV-Reklam-Merkezi-Yonetim-Kilavuzu.docx
@@ -129,7 +129,7 @@
           <w:color w:val="66717C"/>
           <w:sz w:val="19"/>
         </w:rPr>
-        <w:t>Sürüm 1.0  |  31 Ağustos 2026  |  Yönetici ve Yayın Yönetmeni</w:t>
+        <w:t>Sürüm 1.1  |  31 Ağustos 2026  |  Yönetici ve Yayın Yönetmeni</w:t>
       </w:r>
     </w:p>
     <w:p>
@@ -140,7 +140,7 @@
       <w:r>
         <w:drawing>
           <wp:inline xmlns:a="http://schemas.openxmlformats.org/drawingml/2006/main" xmlns:pic="http://schemas.openxmlformats.org/drawingml/2006/picture">
-            <wp:extent cx="5806440" cy="4080574"/>
+            <wp:extent cx="5806440" cy="4078443"/>
             <wp:docPr id="2" name="Picture 2" descr="Koza TV Reklam Merkezi genel yönetim ekranı" title="Koza TV Reklam Merkezi genel yönetim ekranı"/>
             <wp:cNvGraphicFramePr>
               <a:graphicFrameLocks noChangeAspect="1"/>
@@ -149,7 +149,7 @@
               <a:graphicData uri="http://schemas.openxmlformats.org/drawingml/2006/picture">
                 <pic:pic>
                   <pic:nvPicPr>
-                    <pic:cNvPr id="0" name="05-reklam-alanlari.jpg"/>
+                    <pic:cNvPr id="0" name="05-reklam-alanlari-wide.png"/>
                     <pic:cNvPicPr/>
                   </pic:nvPicPr>
                   <pic:blipFill>
@@ -161,7 +161,7 @@
                   <pic:spPr>
                     <a:xfrm>
                       <a:off x="0" y="0"/>
-                      <a:ext cx="5806440" cy="4080574"/>
+                      <a:ext cx="5806440" cy="4078443"/>
                     </a:xfrm>
                     <a:prstGeom prst="rect"/>
                   </pic:spPr>
@@ -186,7 +186,7 @@
           <w:color w:val="66717C"/>
           <w:sz w:val="17"/>
         </w:rPr>
-        <w:t>Reklam Merkezi: dört alan ve yeni reklam formu aynı ekranda yönetilir.</w:t>
+        <w:t>Reklam Merkezi: altı alan ve yeni reklam formu aynı ekranda yönetilir.</w:t>
       </w:r>
     </w:p>
     <w:p>
@@ -395,7 +395,7 @@
           <w:color w:val="1C2229"/>
           <w:sz w:val="21"/>
         </w:rPr>
-        <w:t>Açılan ekranda dört reklam alanını ve bu alanlardaki kampanyaları kontrol edin.</w:t>
+        <w:t>Açılan ekranda altı reklam alanını ve bu alanlardaki kampanyaları kontrol edin.</w:t>
       </w:r>
     </w:p>
     <w:p>
@@ -518,7 +518,7 @@
         <w:pStyle w:val="Heading1"/>
       </w:pPr>
       <w:r>
-        <w:t>2. Dört reklam alanını tanıyın</w:t>
+        <w:t>2. Altı reklam alanını tanıyın</w:t>
       </w:r>
     </w:p>
     <w:p>
@@ -601,6 +601,90 @@
           <w:color w:val="101820"/>
           <w:sz w:val="24"/>
         </w:rPr>
+        <w:t>Masaüstü sol duvar</w:t>
+      </w:r>
+    </w:p>
+    <w:p>
+      <w:pPr>
+        <w:spacing w:after="140" w:line="288" w:lineRule="auto"/>
+        <w:ind w:left="518"/>
+      </w:pPr>
+      <w:r>
+        <w:rPr>
+          <w:rFonts w:ascii="Calibri" w:hAnsi="Calibri" w:eastAsia="Calibri"/>
+          <w:b w:val="0"/>
+          <w:i w:val="0"/>
+          <w:color w:val="1C2229"/>
+          <w:sz w:val="21"/>
+        </w:rPr>
+        <w:t>1360 px ve üzeri masaüstünde içerik alanının solunda görünür; 1800 px üzerinde tam 300×600 boyuta çıkar. Tablet ve mobilde gizlenir.</w:t>
+      </w:r>
+    </w:p>
+    <w:p>
+      <w:pPr>
+        <w:keepNext/>
+        <w:spacing w:before="80" w:after="60"/>
+      </w:pPr>
+      <w:r>
+        <w:rPr>
+          <w:rFonts w:ascii="Calibri" w:hAnsi="Calibri" w:eastAsia="Calibri"/>
+          <w:b/>
+          <w:i w:val="0"/>
+          <w:color w:val="D71920"/>
+          <w:sz w:val="26"/>
+        </w:rPr>
+        <w:t xml:space="preserve">03  </w:t>
+      </w:r>
+      <w:r>
+        <w:rPr>
+          <w:rFonts w:ascii="Calibri" w:hAnsi="Calibri" w:eastAsia="Calibri"/>
+          <w:b/>
+          <w:i w:val="0"/>
+          <w:color w:val="101820"/>
+          <w:sz w:val="24"/>
+        </w:rPr>
+        <w:t>Masaüstü sağ duvar</w:t>
+      </w:r>
+    </w:p>
+    <w:p>
+      <w:pPr>
+        <w:spacing w:after="140" w:line="288" w:lineRule="auto"/>
+        <w:ind w:left="518"/>
+      </w:pPr>
+      <w:r>
+        <w:rPr>
+          <w:rFonts w:ascii="Calibri" w:hAnsi="Calibri" w:eastAsia="Calibri"/>
+          <w:b w:val="0"/>
+          <w:i w:val="0"/>
+          <w:color w:val="1C2229"/>
+          <w:sz w:val="21"/>
+        </w:rPr>
+        <w:t>1360 px ve üzeri masaüstünde içerik alanının sağında görünür; sol duvardan bağımsız yönetilir.</w:t>
+      </w:r>
+    </w:p>
+    <w:p>
+      <w:pPr>
+        <w:keepNext/>
+        <w:spacing w:before="80" w:after="60"/>
+      </w:pPr>
+      <w:r>
+        <w:rPr>
+          <w:rFonts w:ascii="Calibri" w:hAnsi="Calibri" w:eastAsia="Calibri"/>
+          <w:b/>
+          <w:i w:val="0"/>
+          <w:color w:val="D71920"/>
+          <w:sz w:val="26"/>
+        </w:rPr>
+        <w:t xml:space="preserve">04  </w:t>
+      </w:r>
+      <w:r>
+        <w:rPr>
+          <w:rFonts w:ascii="Calibri" w:hAnsi="Calibri" w:eastAsia="Calibri"/>
+          <w:b/>
+          <w:i w:val="0"/>
+          <w:color w:val="101820"/>
+          <w:sz w:val="24"/>
+        </w:rPr>
         <w:t>Ana sayfa marka panosu</w:t>
       </w:r>
     </w:p>
@@ -633,7 +717,7 @@
           <w:color w:val="D71920"/>
           <w:sz w:val="26"/>
         </w:rPr>
-        <w:t xml:space="preserve">03  </w:t>
+        <w:t xml:space="preserve">05  </w:t>
       </w:r>
       <w:r>
         <w:rPr>
@@ -675,7 +759,7 @@
           <w:color w:val="D71920"/>
           <w:sz w:val="26"/>
         </w:rPr>
-        <w:t xml:space="preserve">04  </w:t>
+        <w:t xml:space="preserve">06  </w:t>
       </w:r>
       <w:r>
         <w:rPr>
@@ -712,8 +796,8 @@
       <w:r>
         <w:drawing>
           <wp:inline xmlns:a="http://schemas.openxmlformats.org/drawingml/2006/main" xmlns:pic="http://schemas.openxmlformats.org/drawingml/2006/picture">
-            <wp:extent cx="5440680" cy="3823530"/>
-            <wp:docPr id="3" name="Picture 3" descr="Koza TV ana sayfasında site üstü ve marka panosu reklamlarının görünümü" title="Koza TV ana sayfasında site üstü ve marka panosu reklamlarının görünümü"/>
+            <wp:extent cx="4069080" cy="1922586"/>
+            <wp:docPr id="3" name="Picture 3" descr="Koza TV ana sayfasında site üstü, sol duvar ve sağ duvar reklamlarının görünümü" title="Koza TV ana sayfasında site üstü, sol duvar ve sağ duvar reklamlarının görünümü"/>
             <wp:cNvGraphicFramePr>
               <a:graphicFrameLocks noChangeAspect="1"/>
             </wp:cNvGraphicFramePr>
@@ -721,7 +805,7 @@
               <a:graphicData uri="http://schemas.openxmlformats.org/drawingml/2006/picture">
                 <pic:pic>
                   <pic:nvPicPr>
-                    <pic:cNvPr id="0" name="07-ana-sayfa-reklami.jpg"/>
+                    <pic:cNvPr id="0" name="07-ana-sayfa-reklami-wide.png"/>
                     <pic:cNvPicPr/>
                   </pic:nvPicPr>
                   <pic:blipFill>
@@ -733,7 +817,7 @@
                   <pic:spPr>
                     <a:xfrm>
                       <a:off x="0" y="0"/>
-                      <a:ext cx="5440680" cy="3823530"/>
+                      <a:ext cx="4069080" cy="1922586"/>
                     </a:xfrm>
                     <a:prstGeom prst="rect"/>
                   </pic:spPr>
@@ -758,7 +842,7 @@
           <w:color w:val="66717C"/>
           <w:sz w:val="17"/>
         </w:rPr>
-        <w:t>Ana sayfada reklam alanları haber akışından “REKLAM” etiketiyle açıkça ayrılır.</w:t>
+        <w:t>Geniş masaüstünde iki yan duvar ve üst reklam “REKLAM” etiketiyle açıkça ayrılır.</w:t>
       </w:r>
     </w:p>
     <w:p>
@@ -1003,7 +1087,7 @@
       <w:r>
         <w:drawing>
           <wp:inline xmlns:a="http://schemas.openxmlformats.org/drawingml/2006/main" xmlns:pic="http://schemas.openxmlformats.org/drawingml/2006/picture">
-            <wp:extent cx="5623560" cy="3952052"/>
+            <wp:extent cx="5623560" cy="2640824"/>
             <wp:docPr id="4" name="Picture 4" descr="Doldurulmuş örnek Koza TV reklam formu" title="Doldurulmuş örnek Koza TV reklam formu"/>
             <wp:cNvGraphicFramePr>
               <a:graphicFrameLocks noChangeAspect="1"/>
@@ -1012,7 +1096,7 @@
               <a:graphicData uri="http://schemas.openxmlformats.org/drawingml/2006/picture">
                 <pic:pic>
                   <pic:nvPicPr>
-                    <pic:cNvPr id="0" name="02-yeni-reklam-formu.jpg"/>
+                    <pic:cNvPr id="0" name="02-yeni-reklam-formu-wide.png"/>
                     <pic:cNvPicPr/>
                   </pic:nvPicPr>
                   <pic:blipFill>
@@ -1024,7 +1108,7 @@
                   <pic:spPr>
                     <a:xfrm>
                       <a:off x="0" y="0"/>
-                      <a:ext cx="5623560" cy="3952052"/>
+                      <a:ext cx="5623560" cy="2640824"/>
                     </a:xfrm>
                     <a:prstGeom prst="rect"/>
                   </pic:spPr>
@@ -1222,7 +1306,7 @@
       <w:r>
         <w:drawing>
           <wp:inline xmlns:a="http://schemas.openxmlformats.org/drawingml/2006/main" xmlns:pic="http://schemas.openxmlformats.org/drawingml/2006/picture">
-            <wp:extent cx="4983480" cy="3502225"/>
+            <wp:extent cx="3383280" cy="3291840"/>
             <wp:docPr id="5" name="Picture 5" descr="Türkiye saatine göre başlangıç ve bitiş tarihi girilmiş reklam planı" title="Türkiye saatine göre başlangıç ve bitiş tarihi girilmiş reklam planı"/>
             <wp:cNvGraphicFramePr>
               <a:graphicFrameLocks noChangeAspect="1"/>
@@ -1231,7 +1315,7 @@
               <a:graphicData uri="http://schemas.openxmlformats.org/drawingml/2006/picture">
                 <pic:pic>
                   <pic:nvPicPr>
-                    <pic:cNvPr id="0" name="03-yayin-plani.jpg"/>
+                    <pic:cNvPr id="0" name="03-yayin-plani-wide.png"/>
                     <pic:cNvPicPr/>
                   </pic:nvPicPr>
                   <pic:blipFill>
@@ -1243,7 +1327,7 @@
                   <pic:spPr>
                     <a:xfrm>
                       <a:off x="0" y="0"/>
-                      <a:ext cx="4983480" cy="3502225"/>
+                      <a:ext cx="3383280" cy="3291840"/>
                     </a:xfrm>
                     <a:prstGeom prst="rect"/>
                   </pic:spPr>
@@ -1681,7 +1765,7 @@
       <w:r>
         <w:drawing>
           <wp:inline xmlns:a="http://schemas.openxmlformats.org/drawingml/2006/main" xmlns:pic="http://schemas.openxmlformats.org/drawingml/2006/picture">
-            <wp:extent cx="4434840" cy="3116659"/>
+            <wp:extent cx="4434840" cy="2095403"/>
             <wp:docPr id="6" name="Picture 6" descr="Masaüstü ana sayfada Koza TV reklam alanları" title="Masaüstü ana sayfada Koza TV reklam alanları"/>
             <wp:cNvGraphicFramePr>
               <a:graphicFrameLocks noChangeAspect="1"/>
@@ -1690,7 +1774,7 @@
               <a:graphicData uri="http://schemas.openxmlformats.org/drawingml/2006/picture">
                 <pic:pic>
                   <pic:nvPicPr>
-                    <pic:cNvPr id="0" name="07-ana-sayfa-reklami.jpg"/>
+                    <pic:cNvPr id="0" name="07-ana-sayfa-reklami-wide.png"/>
                     <pic:cNvPicPr/>
                   </pic:nvPicPr>
                   <pic:blipFill>
@@ -1702,7 +1786,7 @@
                   <pic:spPr>
                     <a:xfrm>
                       <a:off x="0" y="0"/>
-                      <a:ext cx="4434840" cy="3116659"/>
+                      <a:ext cx="4434840" cy="2095403"/>
                     </a:xfrm>
                     <a:prstGeom prst="rect"/>
                   </pic:spPr>
@@ -1727,7 +1811,7 @@
           <w:color w:val="66717C"/>
           <w:sz w:val="17"/>
         </w:rPr>
-        <w:t>Masaüstü: site üstü reklam ve ana sayfa marka panosu haber akışından açıkça ayrılır.</w:t>
+        <w:t>Masaüstü: 1360 px üzerinde iki yan duvarı; 1800 px üzerinde tam 300×600 görünümü kontrol edin.</w:t>
       </w:r>
     </w:p>
     <w:p>

</xml_diff>